<commit_message>
Wnioski RODO w panelu administratora (wyszukanie po numerze, kopia danych, usunięcie z zapytań; migracja 1100) i procedury naruszeń oraz wniosków osób w dokumencie RODO
Co-Authored-By: Claude Opus 5.5 <noreply@anthropic.com>
Claude-Session: https://claude.ai/code/session_01CLtcebTdiTD95Zxw3a2jtX
</commit_message>
<xml_diff>
--- a/docs/prawne/Ostoja-RODO-i-bezpieczenstwo-szkic.docx
+++ b/docs/prawne/Ostoja-RODO-i-bezpieczenstwo-szkic.docx
@@ -162,7 +162,7 @@
           <w:sz w:val="21"/>
           <w:szCs w:val="21"/>
         </w:rPr>
-        <w:t xml:space="preserve"> 1. Kto jest administratorem czego · 2. Rejestr czynności przetwarzania · 3. Rejestr kategorii czynności (podmiot przetwarzający) · 4. Wzór umowy powierzenia z zakładem · 5. Regulamin dla zakładów – punkty wymagane przez P2B · 6. Polityka prywatności i regulamin dla rodzin · 7. Środki bezpieczeństwa · 8. Przegląd bezpieczeństwa z 16.10.2026 · 9. Lista kontrolna przed prawdziwymi danymi.</w:t>
+        <w:t xml:space="preserve"> 1. Kto jest administratorem czego · 2. Rejestr czynności przetwarzania · 3. Rejestr kategorii czynności (podmiot przetwarzający) · 4. Wzór umowy powierzenia z zakładem · 5. Regulamin dla zakładów – punkty wymagane przez P2B · 6. Polityka prywatności i regulamin dla rodzin · 7. Środki bezpieczeństwa · 8. Przegląd bezpieczeństwa z 16.10.2026 · 9. Lista kontrolna przed prawdziwymi danymi · 10. Procedury: naruszenia i wnioski osób.</w:t>
       </w:r>
     </w:p>
     <w:p>
@@ -5182,7 +5182,7 @@
                 <w:sz w:val="19"/>
                 <w:szCs w:val="19"/>
               </w:rPr>
-              <w:t xml:space="preserve">Wstrzymanie zakładu w panelu administratora – z uzasadnieniem przekazanym zakładowi przed albo w chwili wstrzymania (dziś: przycisk „Wstrzymaj zakład”; uzasadnienie do dodania).</w:t>
+              <w:t xml:space="preserve">Wdrożone: wstrzymanie wymaga podstawy (6 punktów z /regulamin-partnera) i opisu faktów; zakład widzi uzasadnienie w panelu w chwili wstrzymania (Status zakładu, z wydrukiem). Wypowiedzenie z 30-dniowym wyprzedzeniem – w zasadach dla partnerów.</w:t>
             </w:r>
           </w:p>
         </w:tc>
@@ -5292,7 +5292,7 @@
                 <w:sz w:val="19"/>
                 <w:szCs w:val="19"/>
               </w:rPr>
-              <w:t xml:space="preserve">Opiekun partnerów, odpowiedź w 14 dni; rejestr skarg [DO UZUPEŁNIENIA].</w:t>
+              <w:t xml:space="preserve">Wdrożone: odwołanie w panelu (właściciel lub biuro), odpowiedź z uzasadnieniem w 7 dni w panelu administratora (Odwołania), historia statusu i dziennik. Skargi spoza wstrzymań – opiekun partnerów [DO UZUPEŁNIENIA].</w:t>
             </w:r>
           </w:p>
         </w:tc>
@@ -5347,7 +5347,7 @@
                 <w:sz w:val="19"/>
                 <w:szCs w:val="19"/>
               </w:rPr>
-              <w:t xml:space="preserve">Wskazać co najmniej dwóch mediatorów [DO UZUPEŁNIENIA].</w:t>
+              <w:t xml:space="preserve">Miejsce w zasadach dla partnerów przygotowane; wskazać co najmniej dwóch mediatorów [DO UZUPEŁNIENIA].</w:t>
             </w:r>
           </w:p>
         </w:tc>
@@ -6165,7 +6165,7 @@
                 <w:sz w:val="19"/>
                 <w:szCs w:val="19"/>
               </w:rPr>
-              <w:t xml:space="preserve">X-Frame-Options DENY, CSP (frame-ancestors, form-action, base-uri, object-src), nosniff, Permissions-Policy, noindex na wersji testowej.</w:t>
+              <w:t xml:space="preserve">CSP z jednorazowym nonce dla skryptów (strict-dynamic, bez inline), frame-ancestors none, form-action i base-uri self; X-Frame-Options DENY, nosniff, Permissions-Policy, noindex na wersji testowej.</w:t>
             </w:r>
           </w:p>
         </w:tc>
@@ -6220,7 +6220,7 @@
                 <w:sz w:val="19"/>
                 <w:szCs w:val="19"/>
               </w:rPr>
-              <w:t xml:space="preserve">Codzienne zadanie purge_old_data: imię i telefon z zapytań po 90 dniach, szkice po dobie, dziennik po 2 latach.</w:t>
+              <w:t xml:space="preserve">Codzienne zadanie purge_old_data: imię i telefon z zapytań po 90 dniach, szkice po dobie, błędy aplikacji po 30 dniach, dziennik po 2 latach.</w:t>
             </w:r>
           </w:p>
         </w:tc>
@@ -6275,7 +6275,7 @@
                 <w:sz w:val="19"/>
                 <w:szCs w:val="19"/>
               </w:rPr>
-              <w:t xml:space="preserve">Testy bazy (9 plików), testy logiki i testy przeglądarkowe uruchamiane przy każdej zmianie (GitHub Actions).</w:t>
+              <w:t xml:space="preserve">Testy bazy (12 plików), testy logiki i testy przeglądarkowe uruchamiane przy każdej zmianie (GitHub Actions).</w:t>
             </w:r>
           </w:p>
         </w:tc>
@@ -6305,7 +6305,7 @@
                 <w:sz w:val="19"/>
                 <w:szCs w:val="19"/>
               </w:rPr>
-              <w:t xml:space="preserve">Logi</w:t>
+              <w:t xml:space="preserve">Logi i monitoring</w:t>
             </w:r>
           </w:p>
         </w:tc>
@@ -6330,7 +6330,7 @@
                 <w:sz w:val="19"/>
                 <w:szCs w:val="19"/>
               </w:rPr>
-              <w:t xml:space="preserve">Bez PESEL, telefonów i nazwisk; w logach tylko identyfikatory powiadomień i statusy.</w:t>
+              <w:t xml:space="preserve">Bez PESEL, telefonów i nazwisk. Błędy aplikacji zapisywane w bazie zgrupowane po trasie; numery, e-maile, identyfikatory i tokeny zamieniane na znaczniki (w aplikacji i drugi raz w bazie); podgląd w panelu administratora (Błędy).</w:t>
             </w:r>
           </w:p>
         </w:tc>
@@ -6886,7 +6886,7 @@
         <w:pStyle w:val="Heading2"/>
       </w:pPr>
       <w:r>
-        <w:t xml:space="preserve">Do zrobienia</w:t>
+        <w:t xml:space="preserve">Zrobione 16 października (po przeglądzie)</w:t>
       </w:r>
     </w:p>
     <w:p>
@@ -6905,7 +6905,72 @@
           <w:sz w:val="21"/>
           <w:szCs w:val="21"/>
         </w:rPr>
-        <w:t xml:space="preserve">Pełna polityka CSP dla skryptów (nonce) – wymaga zmian w Next.js; dziś CSP ogranicza ramki, formularze i wtyczki.</w:t>
+        <w:t xml:space="preserve">Pełna polityka CSP dla skryptów z nonce (src/middleware.ts); test sprawdza, że wstrzyknięty atrybut zdarzenia się nie wykona.</w:t>
+      </w:r>
+    </w:p>
+    <w:p>
+      <w:pPr>
+        <w:pStyle w:val="ListParagraph"/>
+        <w:numPr>
+          <w:ilvl w:val="0"/>
+          <w:numId w:val="8"/>
+        </w:numPr>
+        <w:spacing w:after="80" w:line="290"/>
+      </w:pPr>
+      <w:r>
+        <w:rPr>
+          <w:rFonts w:ascii="Arial" w:cs="Arial" w:eastAsia="Arial" w:hAnsi="Arial"/>
+          <w:color w:val="1E2422"/>
+          <w:sz w:val="21"/>
+          <w:szCs w:val="21"/>
+        </w:rPr>
+        <w:t xml:space="preserve">Monitoring błędów bez danych osobowych (app_errors, panel Błędy); retencja 30 dni.</w:t>
+      </w:r>
+    </w:p>
+    <w:p>
+      <w:pPr>
+        <w:pStyle w:val="ListParagraph"/>
+        <w:numPr>
+          <w:ilvl w:val="0"/>
+          <w:numId w:val="8"/>
+        </w:numPr>
+        <w:spacing w:after="80" w:line="290"/>
+      </w:pPr>
+      <w:r>
+        <w:rPr>
+          <w:rFonts w:ascii="Arial" w:cs="Arial" w:eastAsia="Arial" w:hAnsi="Arial"/>
+          <w:color w:val="1E2422"/>
+          <w:sz w:val="21"/>
+          <w:szCs w:val="21"/>
+        </w:rPr>
+        <w:t xml:space="preserve">Uzasadnienie przy wstrzymaniu zakładu, odwołania i historia statusu (P2B art. 4 i 11); zasady dla partnerów na /regulamin-partnera.</w:t>
+      </w:r>
+    </w:p>
+    <w:p>
+      <w:pPr>
+        <w:pStyle w:val="ListParagraph"/>
+        <w:numPr>
+          <w:ilvl w:val="0"/>
+          <w:numId w:val="8"/>
+        </w:numPr>
+        <w:spacing w:after="80" w:line="290"/>
+      </w:pPr>
+      <w:r>
+        <w:rPr>
+          <w:rFonts w:ascii="Arial" w:cs="Arial" w:eastAsia="Arial" w:hAnsi="Arial"/>
+          <w:color w:val="1E2422"/>
+          <w:sz w:val="21"/>
+          <w:szCs w:val="21"/>
+        </w:rPr>
+        <w:t xml:space="preserve">Narzędzie do wniosków osób w panelu administratora (wyszukanie po numerze, kopia danych JSON, usunięcie danych z zapytań) i procedury w rozdziale 10.</w:t>
+      </w:r>
+    </w:p>
+    <w:p>
+      <w:pPr>
+        <w:pStyle w:val="Heading2"/>
+      </w:pPr>
+      <w:r>
+        <w:t xml:space="preserve">Do zrobienia</w:t>
       </w:r>
     </w:p>
     <w:p>
@@ -6943,7 +7008,7 @@
           <w:sz w:val="21"/>
           <w:szCs w:val="21"/>
         </w:rPr>
-        <w:t xml:space="preserve">Monitoring błędów bez danych osobowych (np. Sentry z maskowaniem) i alerty.</w:t>
+        <w:t xml:space="preserve">Alerty o nowych błędach (e-mail do opiekuna) – dziś tylko podgląd w panelu.</w:t>
       </w:r>
     </w:p>
     <w:p>
@@ -6962,45 +7027,7 @@
           <w:sz w:val="21"/>
           <w:szCs w:val="21"/>
         </w:rPr>
-        <w:t xml:space="preserve">Procedura naruszeń: kto ocenia, zgłoszenie do UODO w 72 godziny, informowanie zakładów w 24 godziny.</w:t>
-      </w:r>
-    </w:p>
-    <w:p>
-      <w:pPr>
-        <w:pStyle w:val="ListParagraph"/>
-        <w:numPr>
-          <w:ilvl w:val="0"/>
-          <w:numId w:val="8"/>
-        </w:numPr>
-        <w:spacing w:after="80" w:line="290"/>
-      </w:pPr>
-      <w:r>
-        <w:rPr>
-          <w:rFonts w:ascii="Arial" w:cs="Arial" w:eastAsia="Arial" w:hAnsi="Arial"/>
-          <w:color w:val="1E2422"/>
-          <w:sz w:val="21"/>
-          <w:szCs w:val="21"/>
-        </w:rPr>
-        <w:t xml:space="preserve">Procedura realizacji praw osób (dziś ręcznie w SQL przez administratora).</w:t>
-      </w:r>
-    </w:p>
-    <w:p>
-      <w:pPr>
-        <w:pStyle w:val="ListParagraph"/>
-        <w:numPr>
-          <w:ilvl w:val="0"/>
-          <w:numId w:val="8"/>
-        </w:numPr>
-        <w:spacing w:after="80" w:line="290"/>
-      </w:pPr>
-      <w:r>
-        <w:rPr>
-          <w:rFonts w:ascii="Arial" w:cs="Arial" w:eastAsia="Arial" w:hAnsi="Arial"/>
-          <w:color w:val="1E2422"/>
-          <w:sz w:val="21"/>
-          <w:szCs w:val="21"/>
-        </w:rPr>
-        <w:t xml:space="preserve">Uzasadnienie przy wstrzymaniu zakładu (P2B) i rejestr skarg zakładów.</w:t>
+        <w:t xml:space="preserve">Powiadomienie zakładu o wstrzymaniu także e-mailem (trwały nośnik) – dziś w panelu z możliwością wydruku.</w:t>
       </w:r>
     </w:p>
     <w:p>
@@ -7976,6 +8003,216 @@
                 <w:sz w:val="19"/>
                 <w:szCs w:val="19"/>
               </w:rPr>
+              <w:t xml:space="preserve">Claude</w:t>
+            </w:r>
+          </w:p>
+        </w:tc>
+        <w:tc>
+          <w:tcPr>
+            <w:tcW w:type="dxa" w:w="1500"/>
+            <w:tcMar>
+              <w:top w:type="dxa" w:w="70"/>
+              <w:left w:type="dxa" w:w="100"/>
+              <w:bottom w:type="dxa" w:w="70"/>
+              <w:right w:type="dxa" w:w="100"/>
+            </w:tcMar>
+          </w:tcPr>
+          <w:p>
+            <w:pPr>
+              <w:spacing w:after="40" w:line="260"/>
+            </w:pPr>
+            <w:r>
+              <w:rPr>
+                <w:rFonts w:ascii="Arial" w:cs="Arial" w:eastAsia="Arial" w:hAnsi="Arial"/>
+                <w:color w:val="1E2422"/>
+                <w:sz w:val="19"/>
+                <w:szCs w:val="19"/>
+              </w:rPr>
+              <w:t xml:space="preserve">zrobione (wersja testowa)</w:t>
+            </w:r>
+          </w:p>
+        </w:tc>
+      </w:tr>
+      <w:tr>
+        <w:trPr>
+          <w:cantSplit/>
+        </w:trPr>
+        <w:tc>
+          <w:tcPr>
+            <w:tcW w:type="dxa" w:w="600"/>
+            <w:tcMar>
+              <w:top w:type="dxa" w:w="70"/>
+              <w:left w:type="dxa" w:w="100"/>
+              <w:bottom w:type="dxa" w:w="70"/>
+              <w:right w:type="dxa" w:w="100"/>
+            </w:tcMar>
+          </w:tcPr>
+          <w:p>
+            <w:pPr>
+              <w:spacing w:after="40" w:line="260"/>
+            </w:pPr>
+            <w:r>
+              <w:rPr>
+                <w:rFonts w:ascii="Arial" w:cs="Arial" w:eastAsia="Arial" w:hAnsi="Arial"/>
+                <w:color w:val="1E2422"/>
+                <w:sz w:val="19"/>
+                <w:szCs w:val="19"/>
+              </w:rPr>
+              <w:t xml:space="preserve">9</w:t>
+            </w:r>
+          </w:p>
+        </w:tc>
+        <w:tc>
+          <w:tcPr>
+            <w:tcW w:type="dxa" w:w="6038"/>
+            <w:tcMar>
+              <w:top w:type="dxa" w:w="70"/>
+              <w:left w:type="dxa" w:w="100"/>
+              <w:bottom w:type="dxa" w:w="70"/>
+              <w:right w:type="dxa" w:w="100"/>
+            </w:tcMar>
+          </w:tcPr>
+          <w:p>
+            <w:pPr>
+              <w:spacing w:after="40" w:line="260"/>
+            </w:pPr>
+            <w:r>
+              <w:rPr>
+                <w:rFonts w:ascii="Arial" w:cs="Arial" w:eastAsia="Arial" w:hAnsi="Arial"/>
+                <w:color w:val="1E2422"/>
+                <w:sz w:val="19"/>
+                <w:szCs w:val="19"/>
+              </w:rPr>
+              <w:t xml:space="preserve">Procedura naruszeń i realizacji praw osób (rozdział 10) zatwierdzona, wskazana osoba odpowiedzialna i rejestr naruszeń</w:t>
+            </w:r>
+          </w:p>
+        </w:tc>
+        <w:tc>
+          <w:tcPr>
+            <w:tcW w:type="dxa" w:w="1500"/>
+            <w:tcMar>
+              <w:top w:type="dxa" w:w="70"/>
+              <w:left w:type="dxa" w:w="100"/>
+              <w:bottom w:type="dxa" w:w="70"/>
+              <w:right w:type="dxa" w:w="100"/>
+            </w:tcMar>
+          </w:tcPr>
+          <w:p>
+            <w:pPr>
+              <w:spacing w:after="40" w:line="260"/>
+            </w:pPr>
+            <w:r>
+              <w:rPr>
+                <w:rFonts w:ascii="Arial" w:cs="Arial" w:eastAsia="Arial" w:hAnsi="Arial"/>
+                <w:color w:val="1E2422"/>
+                <w:sz w:val="19"/>
+                <w:szCs w:val="19"/>
+              </w:rPr>
+              <w:t xml:space="preserve">założyciel + prawnik</w:t>
+            </w:r>
+          </w:p>
+        </w:tc>
+        <w:tc>
+          <w:tcPr>
+            <w:tcW w:type="dxa" w:w="1500"/>
+            <w:tcMar>
+              <w:top w:type="dxa" w:w="70"/>
+              <w:left w:type="dxa" w:w="100"/>
+              <w:bottom w:type="dxa" w:w="70"/>
+              <w:right w:type="dxa" w:w="100"/>
+            </w:tcMar>
+          </w:tcPr>
+          <w:p>
+            <w:pPr>
+              <w:spacing w:after="40" w:line="260"/>
+            </w:pPr>
+            <w:r>
+              <w:rPr>
+                <w:rFonts w:ascii="Arial" w:cs="Arial" w:eastAsia="Arial" w:hAnsi="Arial"/>
+                <w:color w:val="1E2422"/>
+                <w:sz w:val="19"/>
+                <w:szCs w:val="19"/>
+              </w:rPr>
+              <w:t xml:space="preserve">spisana, do zatwierdzenia</w:t>
+            </w:r>
+          </w:p>
+        </w:tc>
+      </w:tr>
+      <w:tr>
+        <w:trPr>
+          <w:cantSplit/>
+        </w:trPr>
+        <w:tc>
+          <w:tcPr>
+            <w:tcW w:type="dxa" w:w="600"/>
+            <w:tcMar>
+              <w:top w:type="dxa" w:w="70"/>
+              <w:left w:type="dxa" w:w="100"/>
+              <w:bottom w:type="dxa" w:w="70"/>
+              <w:right w:type="dxa" w:w="100"/>
+            </w:tcMar>
+          </w:tcPr>
+          <w:p>
+            <w:pPr>
+              <w:spacing w:after="40" w:line="260"/>
+            </w:pPr>
+            <w:r>
+              <w:rPr>
+                <w:rFonts w:ascii="Arial" w:cs="Arial" w:eastAsia="Arial" w:hAnsi="Arial"/>
+                <w:color w:val="1E2422"/>
+                <w:sz w:val="19"/>
+                <w:szCs w:val="19"/>
+              </w:rPr>
+              <w:t xml:space="preserve">10</w:t>
+            </w:r>
+          </w:p>
+        </w:tc>
+        <w:tc>
+          <w:tcPr>
+            <w:tcW w:type="dxa" w:w="6038"/>
+            <w:tcMar>
+              <w:top w:type="dxa" w:w="70"/>
+              <w:left w:type="dxa" w:w="100"/>
+              <w:bottom w:type="dxa" w:w="70"/>
+              <w:right w:type="dxa" w:w="100"/>
+            </w:tcMar>
+          </w:tcPr>
+          <w:p>
+            <w:pPr>
+              <w:spacing w:after="40" w:line="260"/>
+            </w:pPr>
+            <w:r>
+              <w:rPr>
+                <w:rFonts w:ascii="Arial" w:cs="Arial" w:eastAsia="Arial" w:hAnsi="Arial"/>
+                <w:color w:val="1E2422"/>
+                <w:sz w:val="19"/>
+                <w:szCs w:val="19"/>
+              </w:rPr>
+              <w:t xml:space="preserve">Szkolenie opiekunów: dane rodzin tylko w panelu, notatki bez danych wrażliwych</w:t>
+            </w:r>
+          </w:p>
+        </w:tc>
+        <w:tc>
+          <w:tcPr>
+            <w:tcW w:type="dxa" w:w="1500"/>
+            <w:tcMar>
+              <w:top w:type="dxa" w:w="70"/>
+              <w:left w:type="dxa" w:w="100"/>
+              <w:bottom w:type="dxa" w:w="70"/>
+              <w:right w:type="dxa" w:w="100"/>
+            </w:tcMar>
+          </w:tcPr>
+          <w:p>
+            <w:pPr>
+              <w:spacing w:after="40" w:line="260"/>
+            </w:pPr>
+            <w:r>
+              <w:rPr>
+                <w:rFonts w:ascii="Arial" w:cs="Arial" w:eastAsia="Arial" w:hAnsi="Arial"/>
+                <w:color w:val="1E2422"/>
+                <w:sz w:val="19"/>
+                <w:szCs w:val="19"/>
+              </w:rPr>
               <w:t xml:space="preserve">założyciel</w:t>
             </w:r>
           </w:p>
@@ -8006,217 +8243,514 @@
           </w:p>
         </w:tc>
       </w:tr>
-      <w:tr>
-        <w:trPr>
-          <w:cantSplit/>
-        </w:trPr>
-        <w:tc>
-          <w:tcPr>
-            <w:tcW w:type="dxa" w:w="600"/>
-            <w:tcMar>
-              <w:top w:type="dxa" w:w="70"/>
-              <w:left w:type="dxa" w:w="100"/>
-              <w:bottom w:type="dxa" w:w="70"/>
-              <w:right w:type="dxa" w:w="100"/>
-            </w:tcMar>
-          </w:tcPr>
-          <w:p>
-            <w:pPr>
-              <w:spacing w:after="40" w:line="260"/>
-            </w:pPr>
-            <w:r>
-              <w:rPr>
-                <w:rFonts w:ascii="Arial" w:cs="Arial" w:eastAsia="Arial" w:hAnsi="Arial"/>
-                <w:color w:val="1E2422"/>
-                <w:sz w:val="19"/>
-                <w:szCs w:val="19"/>
-              </w:rPr>
-              <w:t xml:space="preserve">9</w:t>
-            </w:r>
-          </w:p>
-        </w:tc>
-        <w:tc>
-          <w:tcPr>
-            <w:tcW w:type="dxa" w:w="6038"/>
-            <w:tcMar>
-              <w:top w:type="dxa" w:w="70"/>
-              <w:left w:type="dxa" w:w="100"/>
-              <w:bottom w:type="dxa" w:w="70"/>
-              <w:right w:type="dxa" w:w="100"/>
-            </w:tcMar>
-          </w:tcPr>
-          <w:p>
-            <w:pPr>
-              <w:spacing w:after="40" w:line="260"/>
-            </w:pPr>
-            <w:r>
-              <w:rPr>
-                <w:rFonts w:ascii="Arial" w:cs="Arial" w:eastAsia="Arial" w:hAnsi="Arial"/>
-                <w:color w:val="1E2422"/>
-                <w:sz w:val="19"/>
-                <w:szCs w:val="19"/>
-              </w:rPr>
-              <w:t xml:space="preserve">Procedura naruszeń i realizacji praw osób spisana</w:t>
-            </w:r>
-          </w:p>
-        </w:tc>
-        <w:tc>
-          <w:tcPr>
-            <w:tcW w:type="dxa" w:w="1500"/>
-            <w:tcMar>
-              <w:top w:type="dxa" w:w="70"/>
-              <w:left w:type="dxa" w:w="100"/>
-              <w:bottom w:type="dxa" w:w="70"/>
-              <w:right w:type="dxa" w:w="100"/>
-            </w:tcMar>
-          </w:tcPr>
-          <w:p>
-            <w:pPr>
-              <w:spacing w:after="40" w:line="260"/>
-            </w:pPr>
-            <w:r>
-              <w:rPr>
-                <w:rFonts w:ascii="Arial" w:cs="Arial" w:eastAsia="Arial" w:hAnsi="Arial"/>
-                <w:color w:val="1E2422"/>
-                <w:sz w:val="19"/>
-                <w:szCs w:val="19"/>
-              </w:rPr>
-              <w:t xml:space="preserve">założyciel</w:t>
-            </w:r>
-          </w:p>
-        </w:tc>
-        <w:tc>
-          <w:tcPr>
-            <w:tcW w:type="dxa" w:w="1500"/>
-            <w:tcMar>
-              <w:top w:type="dxa" w:w="70"/>
-              <w:left w:type="dxa" w:w="100"/>
-              <w:bottom w:type="dxa" w:w="70"/>
-              <w:right w:type="dxa" w:w="100"/>
-            </w:tcMar>
-          </w:tcPr>
-          <w:p>
-            <w:pPr>
-              <w:spacing w:after="40" w:line="260"/>
-            </w:pPr>
-            <w:r>
-              <w:rPr>
-                <w:rFonts w:ascii="Arial" w:cs="Arial" w:eastAsia="Arial" w:hAnsi="Arial"/>
-                <w:color w:val="1E2422"/>
-                <w:sz w:val="19"/>
-                <w:szCs w:val="19"/>
-              </w:rPr>
-              <w:t xml:space="preserve">do zrobienia</w:t>
-            </w:r>
-          </w:p>
-        </w:tc>
-      </w:tr>
-      <w:tr>
-        <w:trPr>
-          <w:cantSplit/>
-        </w:trPr>
-        <w:tc>
-          <w:tcPr>
-            <w:tcW w:type="dxa" w:w="600"/>
-            <w:tcMar>
-              <w:top w:type="dxa" w:w="70"/>
-              <w:left w:type="dxa" w:w="100"/>
-              <w:bottom w:type="dxa" w:w="70"/>
-              <w:right w:type="dxa" w:w="100"/>
-            </w:tcMar>
-          </w:tcPr>
-          <w:p>
-            <w:pPr>
-              <w:spacing w:after="40" w:line="260"/>
-            </w:pPr>
-            <w:r>
-              <w:rPr>
-                <w:rFonts w:ascii="Arial" w:cs="Arial" w:eastAsia="Arial" w:hAnsi="Arial"/>
-                <w:color w:val="1E2422"/>
-                <w:sz w:val="19"/>
-                <w:szCs w:val="19"/>
-              </w:rPr>
-              <w:t xml:space="preserve">10</w:t>
-            </w:r>
-          </w:p>
-        </w:tc>
-        <w:tc>
-          <w:tcPr>
-            <w:tcW w:type="dxa" w:w="6038"/>
-            <w:tcMar>
-              <w:top w:type="dxa" w:w="70"/>
-              <w:left w:type="dxa" w:w="100"/>
-              <w:bottom w:type="dxa" w:w="70"/>
-              <w:right w:type="dxa" w:w="100"/>
-            </w:tcMar>
-          </w:tcPr>
-          <w:p>
-            <w:pPr>
-              <w:spacing w:after="40" w:line="260"/>
-            </w:pPr>
-            <w:r>
-              <w:rPr>
-                <w:rFonts w:ascii="Arial" w:cs="Arial" w:eastAsia="Arial" w:hAnsi="Arial"/>
-                <w:color w:val="1E2422"/>
-                <w:sz w:val="19"/>
-                <w:szCs w:val="19"/>
-              </w:rPr>
-              <w:t xml:space="preserve">Szkolenie opiekunów: dane rodzin tylko w panelu, notatki bez danych wrażliwych</w:t>
-            </w:r>
-          </w:p>
-        </w:tc>
-        <w:tc>
-          <w:tcPr>
-            <w:tcW w:type="dxa" w:w="1500"/>
-            <w:tcMar>
-              <w:top w:type="dxa" w:w="70"/>
-              <w:left w:type="dxa" w:w="100"/>
-              <w:bottom w:type="dxa" w:w="70"/>
-              <w:right w:type="dxa" w:w="100"/>
-            </w:tcMar>
-          </w:tcPr>
-          <w:p>
-            <w:pPr>
-              <w:spacing w:after="40" w:line="260"/>
-            </w:pPr>
-            <w:r>
-              <w:rPr>
-                <w:rFonts w:ascii="Arial" w:cs="Arial" w:eastAsia="Arial" w:hAnsi="Arial"/>
-                <w:color w:val="1E2422"/>
-                <w:sz w:val="19"/>
-                <w:szCs w:val="19"/>
-              </w:rPr>
-              <w:t xml:space="preserve">założyciel</w:t>
-            </w:r>
-          </w:p>
-        </w:tc>
-        <w:tc>
-          <w:tcPr>
-            <w:tcW w:type="dxa" w:w="1500"/>
-            <w:tcMar>
-              <w:top w:type="dxa" w:w="70"/>
-              <w:left w:type="dxa" w:w="100"/>
-              <w:bottom w:type="dxa" w:w="70"/>
-              <w:right w:type="dxa" w:w="100"/>
-            </w:tcMar>
-          </w:tcPr>
-          <w:p>
-            <w:pPr>
-              <w:spacing w:after="40" w:line="260"/>
-            </w:pPr>
-            <w:r>
-              <w:rPr>
-                <w:rFonts w:ascii="Arial" w:cs="Arial" w:eastAsia="Arial" w:hAnsi="Arial"/>
-                <w:color w:val="1E2422"/>
-                <w:sz w:val="19"/>
-                <w:szCs w:val="19"/>
-              </w:rPr>
-              <w:t xml:space="preserve">do zrobienia</w:t>
-            </w:r>
-          </w:p>
-        </w:tc>
-      </w:tr>
     </w:tbl>
+    <w:p>
+      <w:r>
+        <w:br w:type="page"/>
+      </w:r>
+    </w:p>
+    <w:p>
+      <w:pPr>
+        <w:pStyle w:val="Heading1"/>
+      </w:pPr>
+      <w:r>
+        <w:t xml:space="preserve">10. Procedury: naruszenia ochrony danych i wnioski osób</w:t>
+      </w:r>
+    </w:p>
+    <w:p>
+      <w:pPr>
+        <w:pStyle w:val="Heading2"/>
+      </w:pPr>
+      <w:r>
+        <w:t xml:space="preserve">10.1. Naruszenie ochrony danych (art. 33 i 34 RODO)</w:t>
+      </w:r>
+    </w:p>
+    <w:p>
+      <w:pPr>
+        <w:spacing w:after="120" w:line="300"/>
+      </w:pPr>
+      <w:r>
+        <w:rPr>
+          <w:rFonts w:ascii="Arial" w:cs="Arial" w:eastAsia="Arial" w:hAnsi="Arial"/>
+          <w:color w:val="1E2422"/>
+          <w:sz w:val="21"/>
+          <w:szCs w:val="21"/>
+        </w:rPr>
+        <w:t xml:space="preserve">Naruszenie to każde zdarzenie, w którym dane mogły zostać ujawnione, zmienione albo utracone – np. wyciek klucza, błąd uprawnień, zgubiony telefon z zalogowanym panelem, SMS wysłany na zły numer.</w:t>
+      </w:r>
+    </w:p>
+    <w:p>
+      <w:pPr>
+        <w:pStyle w:val="ListParagraph"/>
+        <w:numPr>
+          <w:ilvl w:val="0"/>
+          <w:numId w:val="9"/>
+        </w:numPr>
+        <w:spacing w:after="90" w:line="290"/>
+      </w:pPr>
+      <w:r>
+        <w:rPr>
+          <w:rFonts w:ascii="Arial" w:cs="Arial" w:eastAsia="Arial" w:hAnsi="Arial"/>
+          <w:b/>
+          <w:bCs/>
+          <w:color w:val="1E2422"/>
+          <w:sz w:val="21"/>
+          <w:szCs w:val="21"/>
+        </w:rPr>
+        <w:t xml:space="preserve">Zgłoszenie (od razu).</w:t>
+      </w:r>
+      <w:r>
+        <w:rPr>
+          <w:rFonts w:ascii="Arial" w:cs="Arial" w:eastAsia="Arial" w:hAnsi="Arial"/>
+          <w:color w:val="1E2422"/>
+          <w:sz w:val="21"/>
+          <w:szCs w:val="21"/>
+        </w:rPr>
+        <w:t xml:space="preserve"> Każdy, kto zauważy zdarzenie (opiekun, zakład, dostawca), zgłasza je osobie odpowiedzialnej za dane [DO UZUPEŁNIENIA] telefonicznie i e-mailem. Godzinę zgłoszenia zapisujemy – od niej liczy się 72 godziny.</w:t>
+      </w:r>
+    </w:p>
+    <w:p>
+      <w:pPr>
+        <w:pStyle w:val="ListParagraph"/>
+        <w:numPr>
+          <w:ilvl w:val="0"/>
+          <w:numId w:val="9"/>
+        </w:numPr>
+        <w:spacing w:after="90" w:line="290"/>
+      </w:pPr>
+      <w:r>
+        <w:rPr>
+          <w:rFonts w:ascii="Arial" w:cs="Arial" w:eastAsia="Arial" w:hAnsi="Arial"/>
+          <w:b/>
+          <w:bCs/>
+          <w:color w:val="1E2422"/>
+          <w:sz w:val="21"/>
+          <w:szCs w:val="21"/>
+        </w:rPr>
+        <w:t xml:space="preserve">Ograniczenie skutków (do 4 godzin).</w:t>
+      </w:r>
+      <w:r>
+        <w:rPr>
+          <w:rFonts w:ascii="Arial" w:cs="Arial" w:eastAsia="Arial" w:hAnsi="Arial"/>
+          <w:color w:val="1E2422"/>
+          <w:sz w:val="21"/>
+          <w:szCs w:val="21"/>
+        </w:rPr>
+        <w:t xml:space="preserve"> Wylogowanie sesji (zmiana SESSION_SECRET), obrót kluczy (Supabase, SMSAPI, VAPID), wstrzymanie zakładu albo odebranie dostępu osobie, poprawka uprawnień nową migracją. Dziennik admin_audit i logi Vercel zachowujemy.</w:t>
+      </w:r>
+    </w:p>
+    <w:p>
+      <w:pPr>
+        <w:pStyle w:val="ListParagraph"/>
+        <w:numPr>
+          <w:ilvl w:val="0"/>
+          <w:numId w:val="9"/>
+        </w:numPr>
+        <w:spacing w:after="90" w:line="290"/>
+      </w:pPr>
+      <w:r>
+        <w:rPr>
+          <w:rFonts w:ascii="Arial" w:cs="Arial" w:eastAsia="Arial" w:hAnsi="Arial"/>
+          <w:b/>
+          <w:bCs/>
+          <w:color w:val="1E2422"/>
+          <w:sz w:val="21"/>
+          <w:szCs w:val="21"/>
+        </w:rPr>
+        <w:t xml:space="preserve">Ocena ryzyka (do 24 godzin).</w:t>
+      </w:r>
+      <w:r>
+        <w:rPr>
+          <w:rFonts w:ascii="Arial" w:cs="Arial" w:eastAsia="Arial" w:hAnsi="Arial"/>
+          <w:color w:val="1E2422"/>
+          <w:sz w:val="21"/>
+          <w:szCs w:val="21"/>
+        </w:rPr>
+        <w:t xml:space="preserve"> Jakie dane, ilu osób, czy były zaszyfrowane, czy ktoś je odczytał. Dane rodzin w żałobie (telefon, dane osoby zmarłej) traktujemy jako dane o podwyższonym ryzyku.</w:t>
+      </w:r>
+    </w:p>
+    <w:p>
+      <w:pPr>
+        <w:pStyle w:val="ListParagraph"/>
+        <w:numPr>
+          <w:ilvl w:val="0"/>
+          <w:numId w:val="9"/>
+        </w:numPr>
+        <w:spacing w:after="90" w:line="290"/>
+      </w:pPr>
+      <w:r>
+        <w:rPr>
+          <w:rFonts w:ascii="Arial" w:cs="Arial" w:eastAsia="Arial" w:hAnsi="Arial"/>
+          <w:b/>
+          <w:bCs/>
+          <w:color w:val="1E2422"/>
+          <w:sz w:val="21"/>
+          <w:szCs w:val="21"/>
+        </w:rPr>
+        <w:t xml:space="preserve">Zakłady (do 24 godzin).</w:t>
+      </w:r>
+      <w:r>
+        <w:rPr>
+          <w:rFonts w:ascii="Arial" w:cs="Arial" w:eastAsia="Arial" w:hAnsi="Arial"/>
+          <w:color w:val="1E2422"/>
+          <w:sz w:val="21"/>
+          <w:szCs w:val="21"/>
+        </w:rPr>
+        <w:t xml:space="preserve"> Gdy naruszenie dotyczy danych zleceń, Ostoja jako podmiot przetwarzający zawiadamia zakład (administratora) – zgodnie z umową powierzenia (rozdział 4).</w:t>
+      </w:r>
+    </w:p>
+    <w:p>
+      <w:pPr>
+        <w:pStyle w:val="ListParagraph"/>
+        <w:numPr>
+          <w:ilvl w:val="0"/>
+          <w:numId w:val="9"/>
+        </w:numPr>
+        <w:spacing w:after="90" w:line="290"/>
+      </w:pPr>
+      <w:r>
+        <w:rPr>
+          <w:rFonts w:ascii="Arial" w:cs="Arial" w:eastAsia="Arial" w:hAnsi="Arial"/>
+          <w:b/>
+          <w:bCs/>
+          <w:color w:val="1E2422"/>
+          <w:sz w:val="21"/>
+          <w:szCs w:val="21"/>
+        </w:rPr>
+        <w:t xml:space="preserve">UODO (do 72 godzin).</w:t>
+      </w:r>
+      <w:r>
+        <w:rPr>
+          <w:rFonts w:ascii="Arial" w:cs="Arial" w:eastAsia="Arial" w:hAnsi="Arial"/>
+          <w:color w:val="1E2422"/>
+          <w:sz w:val="21"/>
+          <w:szCs w:val="21"/>
+        </w:rPr>
+        <w:t xml:space="preserve"> Gdy naruszenie może powodować ryzyko dla osób, zgłoszenie przez formularz na stronie UODO. Gdy nie wszystko wiadomo – zgłoszenie wstępne i uzupełnienie.</w:t>
+      </w:r>
+    </w:p>
+    <w:p>
+      <w:pPr>
+        <w:pStyle w:val="ListParagraph"/>
+        <w:numPr>
+          <w:ilvl w:val="0"/>
+          <w:numId w:val="9"/>
+        </w:numPr>
+        <w:spacing w:after="90" w:line="290"/>
+      </w:pPr>
+      <w:r>
+        <w:rPr>
+          <w:rFonts w:ascii="Arial" w:cs="Arial" w:eastAsia="Arial" w:hAnsi="Arial"/>
+          <w:b/>
+          <w:bCs/>
+          <w:color w:val="1E2422"/>
+          <w:sz w:val="21"/>
+          <w:szCs w:val="21"/>
+        </w:rPr>
+        <w:t xml:space="preserve">Osoby (bez zbędnej zwłoki).</w:t>
+      </w:r>
+      <w:r>
+        <w:rPr>
+          <w:rFonts w:ascii="Arial" w:cs="Arial" w:eastAsia="Arial" w:hAnsi="Arial"/>
+          <w:color w:val="1E2422"/>
+          <w:sz w:val="21"/>
+          <w:szCs w:val="21"/>
+        </w:rPr>
+        <w:t xml:space="preserve"> Gdy ryzyko jest wysokie – SMS lub telefon do osób: co się stało, jakie dane, co zrobiliśmy, co mogą zrobić, kontakt do opiekuna.</w:t>
+      </w:r>
+    </w:p>
+    <w:p>
+      <w:pPr>
+        <w:pStyle w:val="ListParagraph"/>
+        <w:numPr>
+          <w:ilvl w:val="0"/>
+          <w:numId w:val="9"/>
+        </w:numPr>
+        <w:spacing w:after="90" w:line="290"/>
+      </w:pPr>
+      <w:r>
+        <w:rPr>
+          <w:rFonts w:ascii="Arial" w:cs="Arial" w:eastAsia="Arial" w:hAnsi="Arial"/>
+          <w:b/>
+          <w:bCs/>
+          <w:color w:val="1E2422"/>
+          <w:sz w:val="21"/>
+          <w:szCs w:val="21"/>
+        </w:rPr>
+        <w:t xml:space="preserve">Rejestr naruszeń.</w:t>
+      </w:r>
+      <w:r>
+        <w:rPr>
+          <w:rFonts w:ascii="Arial" w:cs="Arial" w:eastAsia="Arial" w:hAnsi="Arial"/>
+          <w:color w:val="1E2422"/>
+          <w:sz w:val="21"/>
+          <w:szCs w:val="21"/>
+        </w:rPr>
+        <w:t xml:space="preserve"> Każde zdarzenie – także niezgłoszone do UODO – wpisujemy do rejestru: data, opis, skutki, decyzja o zgłoszeniu z uzasadnieniem, działania naprawcze [DO UZUPEŁNIENIA] (arkusz lub dokument).</w:t>
+      </w:r>
+    </w:p>
+    <w:p>
+      <w:pPr>
+        <w:pStyle w:val="Heading2"/>
+      </w:pPr>
+      <w:r>
+        <w:t xml:space="preserve">10.2. Wnioski osób (art. 15–22 RODO)</w:t>
+      </w:r>
+    </w:p>
+    <w:p>
+      <w:pPr>
+        <w:spacing w:after="120" w:line="300"/>
+      </w:pPr>
+      <w:r>
+        <w:rPr>
+          <w:rFonts w:ascii="Arial" w:cs="Arial" w:eastAsia="Arial" w:hAnsi="Arial"/>
+          <w:color w:val="1E2422"/>
+          <w:sz w:val="21"/>
+          <w:szCs w:val="21"/>
+        </w:rPr>
+        <w:t xml:space="preserve">Rodziny nie mają kont, więc wniosek przychodzi telefonem, e-mailem albo pismem. Jedyny identyfikator to numer telefonu z zapytania.</w:t>
+      </w:r>
+    </w:p>
+    <w:p>
+      <w:pPr>
+        <w:pStyle w:val="ListParagraph"/>
+        <w:numPr>
+          <w:ilvl w:val="0"/>
+          <w:numId w:val="10"/>
+        </w:numPr>
+        <w:spacing w:after="90" w:line="290"/>
+      </w:pPr>
+      <w:r>
+        <w:rPr>
+          <w:rFonts w:ascii="Arial" w:cs="Arial" w:eastAsia="Arial" w:hAnsi="Arial"/>
+          <w:b/>
+          <w:bCs/>
+          <w:color w:val="1E2422"/>
+          <w:sz w:val="21"/>
+          <w:szCs w:val="21"/>
+        </w:rPr>
+        <w:t xml:space="preserve">Przyjęcie.</w:t>
+      </w:r>
+      <w:r>
+        <w:rPr>
+          <w:rFonts w:ascii="Arial" w:cs="Arial" w:eastAsia="Arial" w:hAnsi="Arial"/>
+          <w:color w:val="1E2422"/>
+          <w:sz w:val="21"/>
+          <w:szCs w:val="21"/>
+        </w:rPr>
+        <w:t xml:space="preserve"> Opiekun zapisuje datę wniosku (termin odpowiedzi: miesiąc, z możliwością przedłużenia o dwa miesiące z uzasadnieniem).</w:t>
+      </w:r>
+    </w:p>
+    <w:p>
+      <w:pPr>
+        <w:pStyle w:val="ListParagraph"/>
+        <w:numPr>
+          <w:ilvl w:val="0"/>
+          <w:numId w:val="10"/>
+        </w:numPr>
+        <w:spacing w:after="90" w:line="290"/>
+      </w:pPr>
+      <w:r>
+        <w:rPr>
+          <w:rFonts w:ascii="Arial" w:cs="Arial" w:eastAsia="Arial" w:hAnsi="Arial"/>
+          <w:b/>
+          <w:bCs/>
+          <w:color w:val="1E2422"/>
+          <w:sz w:val="21"/>
+          <w:szCs w:val="21"/>
+        </w:rPr>
+        <w:t xml:space="preserve">Tożsamość.</w:t>
+      </w:r>
+      <w:r>
+        <w:rPr>
+          <w:rFonts w:ascii="Arial" w:cs="Arial" w:eastAsia="Arial" w:hAnsi="Arial"/>
+          <w:color w:val="1E2422"/>
+          <w:sz w:val="21"/>
+          <w:szCs w:val="21"/>
+        </w:rPr>
+        <w:t xml:space="preserve"> Oddzwaniamy na numer, którego dotyczy wniosek. Bez tego nie wydajemy ani nie usuwamy danych.</w:t>
+      </w:r>
+    </w:p>
+    <w:p>
+      <w:pPr>
+        <w:pStyle w:val="ListParagraph"/>
+        <w:numPr>
+          <w:ilvl w:val="0"/>
+          <w:numId w:val="10"/>
+        </w:numPr>
+        <w:spacing w:after="90" w:line="290"/>
+      </w:pPr>
+      <w:r>
+        <w:rPr>
+          <w:rFonts w:ascii="Arial" w:cs="Arial" w:eastAsia="Arial" w:hAnsi="Arial"/>
+          <w:b/>
+          <w:bCs/>
+          <w:color w:val="1E2422"/>
+          <w:sz w:val="21"/>
+          <w:szCs w:val="21"/>
+        </w:rPr>
+        <w:t xml:space="preserve">Wyszukanie.</w:t>
+      </w:r>
+      <w:r>
+        <w:rPr>
+          <w:rFonts w:ascii="Arial" w:cs="Arial" w:eastAsia="Arial" w:hAnsi="Arial"/>
+          <w:color w:val="1E2422"/>
+          <w:sz w:val="21"/>
+          <w:szCs w:val="21"/>
+        </w:rPr>
+        <w:t xml:space="preserve"> Panel administratora → Wnioski RODO → numer telefonu. Narzędzie pokazuje zapytania i szkice w Ostoi oraz zakłady, u których jest zlecenie. Numer nie trafia do adresu strony ani do dziennika (tylko końcówka).</w:t>
+      </w:r>
+    </w:p>
+    <w:p>
+      <w:pPr>
+        <w:pStyle w:val="ListParagraph"/>
+        <w:numPr>
+          <w:ilvl w:val="0"/>
+          <w:numId w:val="10"/>
+        </w:numPr>
+        <w:spacing w:after="90" w:line="290"/>
+      </w:pPr>
+      <w:r>
+        <w:rPr>
+          <w:rFonts w:ascii="Arial" w:cs="Arial" w:eastAsia="Arial" w:hAnsi="Arial"/>
+          <w:b/>
+          <w:bCs/>
+          <w:color w:val="1E2422"/>
+          <w:sz w:val="21"/>
+          <w:szCs w:val="21"/>
+        </w:rPr>
+        <w:t xml:space="preserve">Dostęp i kopia (art. 15).</w:t>
+      </w:r>
+      <w:r>
+        <w:rPr>
+          <w:rFonts w:ascii="Arial" w:cs="Arial" w:eastAsia="Arial" w:hAnsi="Arial"/>
+          <w:color w:val="1E2422"/>
+          <w:sz w:val="21"/>
+          <w:szCs w:val="21"/>
+        </w:rPr>
+        <w:t xml:space="preserve"> Przycisk „Przygotuj kopię danych” – plik JSON z zapytaniami i listą zakładów, które dostały zapytanie. Wysyłamy go osobie e-mailem albo odczytujemy przez telefon.</w:t>
+      </w:r>
+    </w:p>
+    <w:p>
+      <w:pPr>
+        <w:pStyle w:val="ListParagraph"/>
+        <w:numPr>
+          <w:ilvl w:val="0"/>
+          <w:numId w:val="10"/>
+        </w:numPr>
+        <w:spacing w:after="90" w:line="290"/>
+      </w:pPr>
+      <w:r>
+        <w:rPr>
+          <w:rFonts w:ascii="Arial" w:cs="Arial" w:eastAsia="Arial" w:hAnsi="Arial"/>
+          <w:b/>
+          <w:bCs/>
+          <w:color w:val="1E2422"/>
+          <w:sz w:val="21"/>
+          <w:szCs w:val="21"/>
+        </w:rPr>
+        <w:t xml:space="preserve">Usunięcie (art. 17) i sprzeciw (art. 21).</w:t>
+      </w:r>
+      <w:r>
+        <w:rPr>
+          <w:rFonts w:ascii="Arial" w:cs="Arial" w:eastAsia="Arial" w:hAnsi="Arial"/>
+          <w:color w:val="1E2422"/>
+          <w:sz w:val="21"/>
+          <w:szCs w:val="21"/>
+        </w:rPr>
+        <w:t xml:space="preserve"> Przycisk „Usuń dane z zapytań” usuwa imię i numer z zapytań Ostoi i szkice. Zlecenia zostają – ich administratorem jest zakład, który może mieć obowiązek przechowywania (umowa, rachunki).</w:t>
+      </w:r>
+    </w:p>
+    <w:p>
+      <w:pPr>
+        <w:pStyle w:val="ListParagraph"/>
+        <w:numPr>
+          <w:ilvl w:val="0"/>
+          <w:numId w:val="10"/>
+        </w:numPr>
+        <w:spacing w:after="90" w:line="290"/>
+      </w:pPr>
+      <w:r>
+        <w:rPr>
+          <w:rFonts w:ascii="Arial" w:cs="Arial" w:eastAsia="Arial" w:hAnsi="Arial"/>
+          <w:b/>
+          <w:bCs/>
+          <w:color w:val="1E2422"/>
+          <w:sz w:val="21"/>
+          <w:szCs w:val="21"/>
+        </w:rPr>
+        <w:t xml:space="preserve">Dane zleceń.</w:t>
+      </w:r>
+      <w:r>
+        <w:rPr>
+          <w:rFonts w:ascii="Arial" w:cs="Arial" w:eastAsia="Arial" w:hAnsi="Arial"/>
+          <w:color w:val="1E2422"/>
+          <w:sz w:val="21"/>
+          <w:szCs w:val="21"/>
+        </w:rPr>
+        <w:t xml:space="preserve"> Wniosek dotyczący zlecenia przekazujemy zakładowi w ciągu 2 dni (dane kontaktowe zakładu są w kopii danych) i informujemy o tym osobę. Pomagamy zakładowi technicznie, jeśli o to poprosi (umowa powierzenia, § 4).</w:t>
+      </w:r>
+    </w:p>
+    <w:p>
+      <w:pPr>
+        <w:pStyle w:val="ListParagraph"/>
+        <w:numPr>
+          <w:ilvl w:val="0"/>
+          <w:numId w:val="10"/>
+        </w:numPr>
+        <w:spacing w:after="90" w:line="290"/>
+      </w:pPr>
+      <w:r>
+        <w:rPr>
+          <w:rFonts w:ascii="Arial" w:cs="Arial" w:eastAsia="Arial" w:hAnsi="Arial"/>
+          <w:b/>
+          <w:bCs/>
+          <w:color w:val="1E2422"/>
+          <w:sz w:val="21"/>
+          <w:szCs w:val="21"/>
+        </w:rPr>
+        <w:t xml:space="preserve">Sprostowanie (art. 16).</w:t>
+      </w:r>
+      <w:r>
+        <w:rPr>
+          <w:rFonts w:ascii="Arial" w:cs="Arial" w:eastAsia="Arial" w:hAnsi="Arial"/>
+          <w:color w:val="1E2422"/>
+          <w:sz w:val="21"/>
+          <w:szCs w:val="21"/>
+        </w:rPr>
+        <w:t xml:space="preserve"> Imię i numer w zapytaniu poprawia opiekun na prośbę osoby; dane zlecenia – zakład w panelu.</w:t>
+      </w:r>
+    </w:p>
+    <w:p>
+      <w:pPr>
+        <w:pStyle w:val="ListParagraph"/>
+        <w:numPr>
+          <w:ilvl w:val="0"/>
+          <w:numId w:val="10"/>
+        </w:numPr>
+        <w:spacing w:after="90" w:line="290"/>
+      </w:pPr>
+      <w:r>
+        <w:rPr>
+          <w:rFonts w:ascii="Arial" w:cs="Arial" w:eastAsia="Arial" w:hAnsi="Arial"/>
+          <w:b/>
+          <w:bCs/>
+          <w:color w:val="1E2422"/>
+          <w:sz w:val="21"/>
+          <w:szCs w:val="21"/>
+        </w:rPr>
+        <w:t xml:space="preserve">Odpowiedź i ślad.</w:t>
+      </w:r>
+      <w:r>
+        <w:rPr>
+          <w:rFonts w:ascii="Arial" w:cs="Arial" w:eastAsia="Arial" w:hAnsi="Arial"/>
+          <w:color w:val="1E2422"/>
+          <w:sz w:val="21"/>
+          <w:szCs w:val="21"/>
+        </w:rPr>
+        <w:t xml:space="preserve"> Odpowiadamy na piśmie (e-mail). W dzienniku administratora zostają wpisy „wniosek RODO – wyszukanie / eksport / usunięcie”.</w:t>
+      </w:r>
+    </w:p>
     <w:sectPr>
       <w:footerReference w:type="default" r:id="rId7"/>
       <w:pgSz w:w="11906" w:h="16838" w:orient="portrait"/>
@@ -8579,6 +9113,46 @@
       </w:rPr>
     </w:lvl>
   </w:abstractNum>
+  <w:abstractNum w:abstractNumId="9" w15:restartNumberingAfterBreak="0">
+    <w:multiLevelType w:val="hybridMultilevel"/>
+    <w:lvl w:ilvl="0" w15:tentative="1">
+      <w:start w:val="1"/>
+      <w:numFmt w:val="decimal"/>
+      <w:lvlText w:val="%1."/>
+      <w:lvlJc w:val="left"/>
+      <w:pPr>
+        <w:ind w:left="400" w:hanging="400"/>
+      </w:pPr>
+      <w:rPr>
+        <w:rFonts w:ascii="Arial" w:cs="Arial" w:eastAsia="Arial" w:hAnsi="Arial"/>
+        <w:b/>
+        <w:bCs/>
+        <w:color w:val="3F5650"/>
+        <w:sz w:val="21"/>
+        <w:szCs w:val="21"/>
+      </w:rPr>
+    </w:lvl>
+  </w:abstractNum>
+  <w:abstractNum w:abstractNumId="10" w15:restartNumberingAfterBreak="0">
+    <w:multiLevelType w:val="hybridMultilevel"/>
+    <w:lvl w:ilvl="0" w15:tentative="1">
+      <w:start w:val="1"/>
+      <w:numFmt w:val="decimal"/>
+      <w:lvlText w:val="%1."/>
+      <w:lvlJc w:val="left"/>
+      <w:pPr>
+        <w:ind w:left="400" w:hanging="400"/>
+      </w:pPr>
+      <w:rPr>
+        <w:rFonts w:ascii="Arial" w:cs="Arial" w:eastAsia="Arial" w:hAnsi="Arial"/>
+        <w:b/>
+        <w:bCs/>
+        <w:color w:val="3F5650"/>
+        <w:sz w:val="21"/>
+        <w:szCs w:val="21"/>
+      </w:rPr>
+    </w:lvl>
+  </w:abstractNum>
   <w:num w:numId="1">
     <w:abstractNumId w:val="1"/>
     <w:lvlOverride w:ilvl="0">
@@ -8623,6 +9197,18 @@
   </w:num>
   <w:num w:numId="8">
     <w:abstractNumId w:val="2"/>
+    <w:lvlOverride w:ilvl="0">
+      <w:startOverride w:val="1"/>
+    </w:lvlOverride>
+  </w:num>
+  <w:num w:numId="9">
+    <w:abstractNumId w:val="9"/>
+    <w:lvlOverride w:ilvl="0">
+      <w:startOverride w:val="1"/>
+    </w:lvlOverride>
+  </w:num>
+  <w:num w:numId="10">
+    <w:abstractNumId w:val="10"/>
     <w:lvlOverride w:ilvl="0">
       <w:startOverride w:val="1"/>
     </w:lvlOverride>

</xml_diff>